<commit_message>
Add Git commit link to M2 review
</commit_message>
<xml_diff>
--- a/evidence/Shakeeba_M2_sample_review.docx
+++ b/evidence/Shakeeba_M2_sample_review.docx
@@ -987,8 +987,22 @@
         <w:t>GitHub commit link:</w:t>
       </w:r>
       <w:r>
-        <w:t xml:space="preserve"> [Pending upload]</w:t>
-      </w:r>
+        <w:t xml:space="preserve"> </w:t>
+      </w:r>
+      <w:hyperlink r:id="rId9" w:history="1">
+        <w:r>
+          <w:rPr>
+            <w:rStyle w:val="Hyperlink"/>
+          </w:rPr>
+          <w:t>https://github.com/BenDelaneyy/CS4928-Group-16/commit/886a23ed1cb0071ee443398ce8ce2cf477a6d45a</w:t>
+        </w:r>
+      </w:hyperlink>
+    </w:p>
+    <w:p>
+      <w:pPr>
+        <w:pStyle w:val="ListParagraph"/>
+        <w:jc w:val="both"/>
+      </w:pPr>
     </w:p>
     <w:p>
       <w:pPr>
@@ -2016,6 +2030,29 @@
       <w:spacing w:val="5"/>
     </w:rPr>
   </w:style>
+  <w:style w:type="character" w:styleId="Hyperlink">
+    <w:name w:val="Hyperlink"/>
+    <w:basedOn w:val="DefaultParagraphFont"/>
+    <w:uiPriority w:val="99"/>
+    <w:unhideWhenUsed/>
+    <w:rsid w:val="00305126"/>
+    <w:rPr>
+      <w:color w:val="467886" w:themeColor="hyperlink"/>
+      <w:u w:val="single"/>
+    </w:rPr>
+  </w:style>
+  <w:style w:type="character" w:styleId="UnresolvedMention">
+    <w:name w:val="Unresolved Mention"/>
+    <w:basedOn w:val="DefaultParagraphFont"/>
+    <w:uiPriority w:val="99"/>
+    <w:semiHidden/>
+    <w:unhideWhenUsed/>
+    <w:rsid w:val="00305126"/>
+    <w:rPr>
+      <w:color w:val="605E5C"/>
+      <w:shd w:val="clear" w:color="auto" w:fill="E1DFDD"/>
+    </w:rPr>
+  </w:style>
 </w:styles>
 </file>
 

</xml_diff>